<commit_message>
One figure per subject: five PNGs instead of two crowded ones
plot_traj.py now writes fig1_plan (top view on the ecliptic), fig1_xz (xz cut with the
penumbra cone and the Az_min threshold), fig1_3d, fig2_xi_v (xi(t) and |v|(t) against the
halo speed at the touch point) and fig2_shadow (rho(t) vs the penumbral radius, log scale)
- each at its own canvas, 200 dpi, 9-10 pt labels, so nothing has to be squinted at on A4.
Numbers that used to sit in a text panel are no longer duplicated in a picture: they are
already in the report's tables.

make_docx.js embeds all five through a FIG() helper that reads each PNG's width and height
from the IHDR chunk (no magic aspect numbers to go stale) and prints one lead-in caption
per group of figures; Table 1а now shows the real role of each candidate (скрининг /
полное / повтор / выбрана) - previously its "принято" column was empty because it
compared against a label the protocol stopped printing. Report: 16 pages.
</commit_message>
<xml_diff>
--- a/Raschet_L2_perelet.docx
+++ b/Raschet_L2_perelet.docx
@@ -3657,7 +3657,7 @@
           <w:sz w:val="24"/>
           <w:szCs w:val="24"/>
         </w:rPr>
-        <w:t xml:space="preserve">Таблица 1а — уточнённые кандидаты (строка «ДА» - принятая цель)</w:t>
+        <w:t xml:space="preserve">Таблица 1а — кандидаты: скрининг всех беззатменных, полное уточнение лидеров</w:t>
       </w:r>
     </w:p>
     <w:tbl>
@@ -3677,8 +3677,8 @@
         <w:gridCol w:w="1600"/>
         <w:gridCol w:w="1400"/>
         <w:gridCol w:w="1400"/>
-        <w:gridCol w:w="1500"/>
-        <w:gridCol w:w="2055"/>
+        <w:gridCol w:w="1400"/>
+        <w:gridCol w:w="2155"/>
       </w:tblGrid>
       <w:tr>
         <w:trPr>
@@ -3798,7 +3798,7 @@
         </w:tc>
         <w:tc>
           <w:tcPr>
-            <w:tcW w:type="dxa" w:w="1500"/>
+            <w:tcW w:type="dxa" w:w="1400"/>
             <w:shd w:fill="EDEDED" w:val="clear"/>
             <w:tcMar>
               <w:top w:type="dxa" w:w="30"/>
@@ -3826,7 +3826,7 @@
         </w:tc>
         <w:tc>
           <w:tcPr>
-            <w:tcW w:type="dxa" w:w="2055"/>
+            <w:tcW w:type="dxa" w:w="2155"/>
             <w:shd w:fill="EDEDED" w:val="clear"/>
             <w:tcMar>
               <w:top w:type="dxa" w:w="30"/>
@@ -3848,7 +3848,7 @@
                 <w:sz w:val="24"/>
                 <w:szCs w:val="24"/>
               </w:rPr>
-              <w:t xml:space="preserve">принято</w:t>
+              <w:t xml:space="preserve">роль в отборе</w:t>
             </w:r>
           </w:p>
         </w:tc>
@@ -3967,55 +3967,55 @@
         </w:tc>
         <w:tc>
           <w:tcPr>
-            <w:tcW w:type="dxa" w:w="1500"/>
-            <w:tcMar>
-              <w:top w:type="dxa" w:w="30"/>
-              <w:left w:type="dxa" w:w="60"/>
-              <w:bottom w:type="dxa" w:w="30"/>
-              <w:right w:type="dxa" w:w="60"/>
-            </w:tcMar>
-          </w:tcPr>
-          <w:p>
-            <w:pPr>
-              <w:spacing w:after="0" w:line="276"/>
-              <w:jc w:val="left"/>
-            </w:pPr>
-            <w:r>
-              <w:rPr>
-                <w:rFonts w:ascii="Times New Roman" w:cs="Times New Roman" w:eastAsia="Times New Roman" w:hAnsi="Times New Roman"/>
-                <w:b w:val="false"/>
-                <w:bCs w:val="false"/>
-                <w:sz w:val="24"/>
-                <w:szCs w:val="24"/>
-              </w:rPr>
-              <w:t xml:space="preserve">НЕТ</w:t>
-            </w:r>
-          </w:p>
-        </w:tc>
-        <w:tc>
-          <w:tcPr>
-            <w:tcW w:type="dxa" w:w="2055"/>
-            <w:tcMar>
-              <w:top w:type="dxa" w:w="30"/>
-              <w:left w:type="dxa" w:w="60"/>
-              <w:bottom w:type="dxa" w:w="30"/>
-              <w:right w:type="dxa" w:w="60"/>
-            </w:tcMar>
-          </w:tcPr>
-          <w:p>
-            <w:pPr>
-              <w:spacing w:after="0" w:line="276"/>
-              <w:jc w:val="left"/>
-            </w:pPr>
-            <w:r>
-              <w:rPr>
-                <w:rFonts w:ascii="Times New Roman" w:cs="Times New Roman" w:eastAsia="Times New Roman" w:hAnsi="Times New Roman"/>
-                <w:b w:val="false"/>
-                <w:bCs w:val="false"/>
-                <w:sz w:val="24"/>
-                <w:szCs w:val="24"/>
-              </w:rPr>
-              <w:t xml:space="preserve">—</w:t>
+            <w:tcW w:type="dxa" w:w="1400"/>
+            <w:tcMar>
+              <w:top w:type="dxa" w:w="30"/>
+              <w:left w:type="dxa" w:w="60"/>
+              <w:bottom w:type="dxa" w:w="30"/>
+              <w:right w:type="dxa" w:w="60"/>
+            </w:tcMar>
+          </w:tcPr>
+          <w:p>
+            <w:pPr>
+              <w:spacing w:after="0" w:line="276"/>
+              <w:jc w:val="left"/>
+            </w:pPr>
+            <w:r>
+              <w:rPr>
+                <w:rFonts w:ascii="Times New Roman" w:cs="Times New Roman" w:eastAsia="Times New Roman" w:hAnsi="Times New Roman"/>
+                <w:b w:val="false"/>
+                <w:bCs w:val="false"/>
+                <w:sz w:val="24"/>
+                <w:szCs w:val="24"/>
+              </w:rPr>
+              <w:t xml:space="preserve">нет</w:t>
+            </w:r>
+          </w:p>
+        </w:tc>
+        <w:tc>
+          <w:tcPr>
+            <w:tcW w:type="dxa" w:w="2155"/>
+            <w:tcMar>
+              <w:top w:type="dxa" w:w="30"/>
+              <w:left w:type="dxa" w:w="60"/>
+              <w:bottom w:type="dxa" w:w="30"/>
+              <w:right w:type="dxa" w:w="60"/>
+            </w:tcMar>
+          </w:tcPr>
+          <w:p>
+            <w:pPr>
+              <w:spacing w:after="0" w:line="276"/>
+              <w:jc w:val="left"/>
+            </w:pPr>
+            <w:r>
+              <w:rPr>
+                <w:rFonts w:ascii="Times New Roman" w:cs="Times New Roman" w:eastAsia="Times New Roman" w:hAnsi="Times New Roman"/>
+                <w:b w:val="false"/>
+                <w:bCs w:val="false"/>
+                <w:sz w:val="24"/>
+                <w:szCs w:val="24"/>
+              </w:rPr>
+              <w:t xml:space="preserve">скрининг</w:t>
             </w:r>
           </w:p>
         </w:tc>
@@ -4134,55 +4134,55 @@
         </w:tc>
         <w:tc>
           <w:tcPr>
-            <w:tcW w:type="dxa" w:w="1500"/>
-            <w:tcMar>
-              <w:top w:type="dxa" w:w="30"/>
-              <w:left w:type="dxa" w:w="60"/>
-              <w:bottom w:type="dxa" w:w="30"/>
-              <w:right w:type="dxa" w:w="60"/>
-            </w:tcMar>
-          </w:tcPr>
-          <w:p>
-            <w:pPr>
-              <w:spacing w:after="0" w:line="276"/>
-              <w:jc w:val="left"/>
-            </w:pPr>
-            <w:r>
-              <w:rPr>
-                <w:rFonts w:ascii="Times New Roman" w:cs="Times New Roman" w:eastAsia="Times New Roman" w:hAnsi="Times New Roman"/>
-                <w:b w:val="false"/>
-                <w:bCs w:val="false"/>
-                <w:sz w:val="24"/>
-                <w:szCs w:val="24"/>
-              </w:rPr>
-              <w:t xml:space="preserve">НЕТ</w:t>
-            </w:r>
-          </w:p>
-        </w:tc>
-        <w:tc>
-          <w:tcPr>
-            <w:tcW w:type="dxa" w:w="2055"/>
-            <w:tcMar>
-              <w:top w:type="dxa" w:w="30"/>
-              <w:left w:type="dxa" w:w="60"/>
-              <w:bottom w:type="dxa" w:w="30"/>
-              <w:right w:type="dxa" w:w="60"/>
-            </w:tcMar>
-          </w:tcPr>
-          <w:p>
-            <w:pPr>
-              <w:spacing w:after="0" w:line="276"/>
-              <w:jc w:val="left"/>
-            </w:pPr>
-            <w:r>
-              <w:rPr>
-                <w:rFonts w:ascii="Times New Roman" w:cs="Times New Roman" w:eastAsia="Times New Roman" w:hAnsi="Times New Roman"/>
-                <w:b w:val="false"/>
-                <w:bCs w:val="false"/>
-                <w:sz w:val="24"/>
-                <w:szCs w:val="24"/>
-              </w:rPr>
-              <w:t xml:space="preserve">—</w:t>
+            <w:tcW w:type="dxa" w:w="1400"/>
+            <w:tcMar>
+              <w:top w:type="dxa" w:w="30"/>
+              <w:left w:type="dxa" w:w="60"/>
+              <w:bottom w:type="dxa" w:w="30"/>
+              <w:right w:type="dxa" w:w="60"/>
+            </w:tcMar>
+          </w:tcPr>
+          <w:p>
+            <w:pPr>
+              <w:spacing w:after="0" w:line="276"/>
+              <w:jc w:val="left"/>
+            </w:pPr>
+            <w:r>
+              <w:rPr>
+                <w:rFonts w:ascii="Times New Roman" w:cs="Times New Roman" w:eastAsia="Times New Roman" w:hAnsi="Times New Roman"/>
+                <w:b w:val="false"/>
+                <w:bCs w:val="false"/>
+                <w:sz w:val="24"/>
+                <w:szCs w:val="24"/>
+              </w:rPr>
+              <w:t xml:space="preserve">нет</w:t>
+            </w:r>
+          </w:p>
+        </w:tc>
+        <w:tc>
+          <w:tcPr>
+            <w:tcW w:type="dxa" w:w="2155"/>
+            <w:tcMar>
+              <w:top w:type="dxa" w:w="30"/>
+              <w:left w:type="dxa" w:w="60"/>
+              <w:bottom w:type="dxa" w:w="30"/>
+              <w:right w:type="dxa" w:w="60"/>
+            </w:tcMar>
+          </w:tcPr>
+          <w:p>
+            <w:pPr>
+              <w:spacing w:after="0" w:line="276"/>
+              <w:jc w:val="left"/>
+            </w:pPr>
+            <w:r>
+              <w:rPr>
+                <w:rFonts w:ascii="Times New Roman" w:cs="Times New Roman" w:eastAsia="Times New Roman" w:hAnsi="Times New Roman"/>
+                <w:b w:val="false"/>
+                <w:bCs w:val="false"/>
+                <w:sz w:val="24"/>
+                <w:szCs w:val="24"/>
+              </w:rPr>
+              <w:t xml:space="preserve">скрининг</w:t>
             </w:r>
           </w:p>
         </w:tc>
@@ -4301,55 +4301,55 @@
         </w:tc>
         <w:tc>
           <w:tcPr>
-            <w:tcW w:type="dxa" w:w="1500"/>
-            <w:tcMar>
-              <w:top w:type="dxa" w:w="30"/>
-              <w:left w:type="dxa" w:w="60"/>
-              <w:bottom w:type="dxa" w:w="30"/>
-              <w:right w:type="dxa" w:w="60"/>
-            </w:tcMar>
-          </w:tcPr>
-          <w:p>
-            <w:pPr>
-              <w:spacing w:after="0" w:line="276"/>
-              <w:jc w:val="left"/>
-            </w:pPr>
-            <w:r>
-              <w:rPr>
-                <w:rFonts w:ascii="Times New Roman" w:cs="Times New Roman" w:eastAsia="Times New Roman" w:hAnsi="Times New Roman"/>
-                <w:b w:val="false"/>
-                <w:bCs w:val="false"/>
-                <w:sz w:val="24"/>
-                <w:szCs w:val="24"/>
-              </w:rPr>
-              <w:t xml:space="preserve">НЕТ</w:t>
-            </w:r>
-          </w:p>
-        </w:tc>
-        <w:tc>
-          <w:tcPr>
-            <w:tcW w:type="dxa" w:w="2055"/>
-            <w:tcMar>
-              <w:top w:type="dxa" w:w="30"/>
-              <w:left w:type="dxa" w:w="60"/>
-              <w:bottom w:type="dxa" w:w="30"/>
-              <w:right w:type="dxa" w:w="60"/>
-            </w:tcMar>
-          </w:tcPr>
-          <w:p>
-            <w:pPr>
-              <w:spacing w:after="0" w:line="276"/>
-              <w:jc w:val="left"/>
-            </w:pPr>
-            <w:r>
-              <w:rPr>
-                <w:rFonts w:ascii="Times New Roman" w:cs="Times New Roman" w:eastAsia="Times New Roman" w:hAnsi="Times New Roman"/>
-                <w:b w:val="false"/>
-                <w:bCs w:val="false"/>
-                <w:sz w:val="24"/>
-                <w:szCs w:val="24"/>
-              </w:rPr>
-              <w:t xml:space="preserve">—</w:t>
+            <w:tcW w:type="dxa" w:w="1400"/>
+            <w:tcMar>
+              <w:top w:type="dxa" w:w="30"/>
+              <w:left w:type="dxa" w:w="60"/>
+              <w:bottom w:type="dxa" w:w="30"/>
+              <w:right w:type="dxa" w:w="60"/>
+            </w:tcMar>
+          </w:tcPr>
+          <w:p>
+            <w:pPr>
+              <w:spacing w:after="0" w:line="276"/>
+              <w:jc w:val="left"/>
+            </w:pPr>
+            <w:r>
+              <w:rPr>
+                <w:rFonts w:ascii="Times New Roman" w:cs="Times New Roman" w:eastAsia="Times New Roman" w:hAnsi="Times New Roman"/>
+                <w:b w:val="false"/>
+                <w:bCs w:val="false"/>
+                <w:sz w:val="24"/>
+                <w:szCs w:val="24"/>
+              </w:rPr>
+              <w:t xml:space="preserve">нет</w:t>
+            </w:r>
+          </w:p>
+        </w:tc>
+        <w:tc>
+          <w:tcPr>
+            <w:tcW w:type="dxa" w:w="2155"/>
+            <w:tcMar>
+              <w:top w:type="dxa" w:w="30"/>
+              <w:left w:type="dxa" w:w="60"/>
+              <w:bottom w:type="dxa" w:w="30"/>
+              <w:right w:type="dxa" w:w="60"/>
+            </w:tcMar>
+          </w:tcPr>
+          <w:p>
+            <w:pPr>
+              <w:spacing w:after="0" w:line="276"/>
+              <w:jc w:val="left"/>
+            </w:pPr>
+            <w:r>
+              <w:rPr>
+                <w:rFonts w:ascii="Times New Roman" w:cs="Times New Roman" w:eastAsia="Times New Roman" w:hAnsi="Times New Roman"/>
+                <w:b w:val="false"/>
+                <w:bCs w:val="false"/>
+                <w:sz w:val="24"/>
+                <w:szCs w:val="24"/>
+              </w:rPr>
+              <w:t xml:space="preserve">скрининг</w:t>
             </w:r>
           </w:p>
         </w:tc>
@@ -4468,55 +4468,55 @@
         </w:tc>
         <w:tc>
           <w:tcPr>
-            <w:tcW w:type="dxa" w:w="1500"/>
-            <w:tcMar>
-              <w:top w:type="dxa" w:w="30"/>
-              <w:left w:type="dxa" w:w="60"/>
-              <w:bottom w:type="dxa" w:w="30"/>
-              <w:right w:type="dxa" w:w="60"/>
-            </w:tcMar>
-          </w:tcPr>
-          <w:p>
-            <w:pPr>
-              <w:spacing w:after="0" w:line="276"/>
-              <w:jc w:val="left"/>
-            </w:pPr>
-            <w:r>
-              <w:rPr>
-                <w:rFonts w:ascii="Times New Roman" w:cs="Times New Roman" w:eastAsia="Times New Roman" w:hAnsi="Times New Roman"/>
-                <w:b w:val="false"/>
-                <w:bCs w:val="false"/>
-                <w:sz w:val="24"/>
-                <w:szCs w:val="24"/>
-              </w:rPr>
-              <w:t xml:space="preserve">НЕТ</w:t>
-            </w:r>
-          </w:p>
-        </w:tc>
-        <w:tc>
-          <w:tcPr>
-            <w:tcW w:type="dxa" w:w="2055"/>
-            <w:tcMar>
-              <w:top w:type="dxa" w:w="30"/>
-              <w:left w:type="dxa" w:w="60"/>
-              <w:bottom w:type="dxa" w:w="30"/>
-              <w:right w:type="dxa" w:w="60"/>
-            </w:tcMar>
-          </w:tcPr>
-          <w:p>
-            <w:pPr>
-              <w:spacing w:after="0" w:line="276"/>
-              <w:jc w:val="left"/>
-            </w:pPr>
-            <w:r>
-              <w:rPr>
-                <w:rFonts w:ascii="Times New Roman" w:cs="Times New Roman" w:eastAsia="Times New Roman" w:hAnsi="Times New Roman"/>
-                <w:b w:val="false"/>
-                <w:bCs w:val="false"/>
-                <w:sz w:val="24"/>
-                <w:szCs w:val="24"/>
-              </w:rPr>
-              <w:t xml:space="preserve">—</w:t>
+            <w:tcW w:type="dxa" w:w="1400"/>
+            <w:tcMar>
+              <w:top w:type="dxa" w:w="30"/>
+              <w:left w:type="dxa" w:w="60"/>
+              <w:bottom w:type="dxa" w:w="30"/>
+              <w:right w:type="dxa" w:w="60"/>
+            </w:tcMar>
+          </w:tcPr>
+          <w:p>
+            <w:pPr>
+              <w:spacing w:after="0" w:line="276"/>
+              <w:jc w:val="left"/>
+            </w:pPr>
+            <w:r>
+              <w:rPr>
+                <w:rFonts w:ascii="Times New Roman" w:cs="Times New Roman" w:eastAsia="Times New Roman" w:hAnsi="Times New Roman"/>
+                <w:b w:val="false"/>
+                <w:bCs w:val="false"/>
+                <w:sz w:val="24"/>
+                <w:szCs w:val="24"/>
+              </w:rPr>
+              <w:t xml:space="preserve">нет</w:t>
+            </w:r>
+          </w:p>
+        </w:tc>
+        <w:tc>
+          <w:tcPr>
+            <w:tcW w:type="dxa" w:w="2155"/>
+            <w:tcMar>
+              <w:top w:type="dxa" w:w="30"/>
+              <w:left w:type="dxa" w:w="60"/>
+              <w:bottom w:type="dxa" w:w="30"/>
+              <w:right w:type="dxa" w:w="60"/>
+            </w:tcMar>
+          </w:tcPr>
+          <w:p>
+            <w:pPr>
+              <w:spacing w:after="0" w:line="276"/>
+              <w:jc w:val="left"/>
+            </w:pPr>
+            <w:r>
+              <w:rPr>
+                <w:rFonts w:ascii="Times New Roman" w:cs="Times New Roman" w:eastAsia="Times New Roman" w:hAnsi="Times New Roman"/>
+                <w:b w:val="false"/>
+                <w:bCs w:val="false"/>
+                <w:sz w:val="24"/>
+                <w:szCs w:val="24"/>
+              </w:rPr>
+              <w:t xml:space="preserve">скрининг</w:t>
             </w:r>
           </w:p>
         </w:tc>
@@ -4635,55 +4635,55 @@
         </w:tc>
         <w:tc>
           <w:tcPr>
-            <w:tcW w:type="dxa" w:w="1500"/>
-            <w:tcMar>
-              <w:top w:type="dxa" w:w="30"/>
-              <w:left w:type="dxa" w:w="60"/>
-              <w:bottom w:type="dxa" w:w="30"/>
-              <w:right w:type="dxa" w:w="60"/>
-            </w:tcMar>
-          </w:tcPr>
-          <w:p>
-            <w:pPr>
-              <w:spacing w:after="0" w:line="276"/>
-              <w:jc w:val="left"/>
-            </w:pPr>
-            <w:r>
-              <w:rPr>
-                <w:rFonts w:ascii="Times New Roman" w:cs="Times New Roman" w:eastAsia="Times New Roman" w:hAnsi="Times New Roman"/>
-                <w:b w:val="false"/>
-                <w:bCs w:val="false"/>
-                <w:sz w:val="24"/>
-                <w:szCs w:val="24"/>
-              </w:rPr>
-              <w:t xml:space="preserve">НЕТ</w:t>
-            </w:r>
-          </w:p>
-        </w:tc>
-        <w:tc>
-          <w:tcPr>
-            <w:tcW w:type="dxa" w:w="2055"/>
-            <w:tcMar>
-              <w:top w:type="dxa" w:w="30"/>
-              <w:left w:type="dxa" w:w="60"/>
-              <w:bottom w:type="dxa" w:w="30"/>
-              <w:right w:type="dxa" w:w="60"/>
-            </w:tcMar>
-          </w:tcPr>
-          <w:p>
-            <w:pPr>
-              <w:spacing w:after="0" w:line="276"/>
-              <w:jc w:val="left"/>
-            </w:pPr>
-            <w:r>
-              <w:rPr>
-                <w:rFonts w:ascii="Times New Roman" w:cs="Times New Roman" w:eastAsia="Times New Roman" w:hAnsi="Times New Roman"/>
-                <w:b w:val="false"/>
-                <w:bCs w:val="false"/>
-                <w:sz w:val="24"/>
-                <w:szCs w:val="24"/>
-              </w:rPr>
-              <w:t xml:space="preserve">—</w:t>
+            <w:tcW w:type="dxa" w:w="1400"/>
+            <w:tcMar>
+              <w:top w:type="dxa" w:w="30"/>
+              <w:left w:type="dxa" w:w="60"/>
+              <w:bottom w:type="dxa" w:w="30"/>
+              <w:right w:type="dxa" w:w="60"/>
+            </w:tcMar>
+          </w:tcPr>
+          <w:p>
+            <w:pPr>
+              <w:spacing w:after="0" w:line="276"/>
+              <w:jc w:val="left"/>
+            </w:pPr>
+            <w:r>
+              <w:rPr>
+                <w:rFonts w:ascii="Times New Roman" w:cs="Times New Roman" w:eastAsia="Times New Roman" w:hAnsi="Times New Roman"/>
+                <w:b w:val="false"/>
+                <w:bCs w:val="false"/>
+                <w:sz w:val="24"/>
+                <w:szCs w:val="24"/>
+              </w:rPr>
+              <w:t xml:space="preserve">нет</w:t>
+            </w:r>
+          </w:p>
+        </w:tc>
+        <w:tc>
+          <w:tcPr>
+            <w:tcW w:type="dxa" w:w="2155"/>
+            <w:tcMar>
+              <w:top w:type="dxa" w:w="30"/>
+              <w:left w:type="dxa" w:w="60"/>
+              <w:bottom w:type="dxa" w:w="30"/>
+              <w:right w:type="dxa" w:w="60"/>
+            </w:tcMar>
+          </w:tcPr>
+          <w:p>
+            <w:pPr>
+              <w:spacing w:after="0" w:line="276"/>
+              <w:jc w:val="left"/>
+            </w:pPr>
+            <w:r>
+              <w:rPr>
+                <w:rFonts w:ascii="Times New Roman" w:cs="Times New Roman" w:eastAsia="Times New Roman" w:hAnsi="Times New Roman"/>
+                <w:b w:val="false"/>
+                <w:bCs w:val="false"/>
+                <w:sz w:val="24"/>
+                <w:szCs w:val="24"/>
+              </w:rPr>
+              <w:t xml:space="preserve">скрининг</w:t>
             </w:r>
           </w:p>
         </w:tc>
@@ -4802,7 +4802,7 @@
         </w:tc>
         <w:tc>
           <w:tcPr>
-            <w:tcW w:type="dxa" w:w="1500"/>
+            <w:tcW w:type="dxa" w:w="1400"/>
             <w:tcMar>
               <w:top w:type="dxa" w:w="30"/>
               <w:left w:type="dxa" w:w="60"/>
@@ -4829,28 +4829,28 @@
         </w:tc>
         <w:tc>
           <w:tcPr>
-            <w:tcW w:type="dxa" w:w="2055"/>
-            <w:tcMar>
-              <w:top w:type="dxa" w:w="30"/>
-              <w:left w:type="dxa" w:w="60"/>
-              <w:bottom w:type="dxa" w:w="30"/>
-              <w:right w:type="dxa" w:w="60"/>
-            </w:tcMar>
-          </w:tcPr>
-          <w:p>
-            <w:pPr>
-              <w:spacing w:after="0" w:line="276"/>
-              <w:jc w:val="left"/>
-            </w:pPr>
-            <w:r>
-              <w:rPr>
-                <w:rFonts w:ascii="Times New Roman" w:cs="Times New Roman" w:eastAsia="Times New Roman" w:hAnsi="Times New Roman"/>
-                <w:b w:val="false"/>
-                <w:bCs w:val="false"/>
-                <w:sz w:val="24"/>
-                <w:szCs w:val="24"/>
-              </w:rPr>
-              <w:t xml:space="preserve">—</w:t>
+            <w:tcW w:type="dxa" w:w="2155"/>
+            <w:tcMar>
+              <w:top w:type="dxa" w:w="30"/>
+              <w:left w:type="dxa" w:w="60"/>
+              <w:bottom w:type="dxa" w:w="30"/>
+              <w:right w:type="dxa" w:w="60"/>
+            </w:tcMar>
+          </w:tcPr>
+          <w:p>
+            <w:pPr>
+              <w:spacing w:after="0" w:line="276"/>
+              <w:jc w:val="left"/>
+            </w:pPr>
+            <w:r>
+              <w:rPr>
+                <w:rFonts w:ascii="Times New Roman" w:cs="Times New Roman" w:eastAsia="Times New Roman" w:hAnsi="Times New Roman"/>
+                <w:b w:val="false"/>
+                <w:bCs w:val="false"/>
+                <w:sz w:val="24"/>
+                <w:szCs w:val="24"/>
+              </w:rPr>
+              <w:t xml:space="preserve">скрининг</w:t>
             </w:r>
           </w:p>
         </w:tc>
@@ -4969,7 +4969,7 @@
         </w:tc>
         <w:tc>
           <w:tcPr>
-            <w:tcW w:type="dxa" w:w="1500"/>
+            <w:tcW w:type="dxa" w:w="1400"/>
             <w:tcMar>
               <w:top w:type="dxa" w:w="30"/>
               <w:left w:type="dxa" w:w="60"/>
@@ -4996,28 +4996,28 @@
         </w:tc>
         <w:tc>
           <w:tcPr>
-            <w:tcW w:type="dxa" w:w="2055"/>
-            <w:tcMar>
-              <w:top w:type="dxa" w:w="30"/>
-              <w:left w:type="dxa" w:w="60"/>
-              <w:bottom w:type="dxa" w:w="30"/>
-              <w:right w:type="dxa" w:w="60"/>
-            </w:tcMar>
-          </w:tcPr>
-          <w:p>
-            <w:pPr>
-              <w:spacing w:after="0" w:line="276"/>
-              <w:jc w:val="left"/>
-            </w:pPr>
-            <w:r>
-              <w:rPr>
-                <w:rFonts w:ascii="Times New Roman" w:cs="Times New Roman" w:eastAsia="Times New Roman" w:hAnsi="Times New Roman"/>
-                <w:b w:val="false"/>
-                <w:bCs w:val="false"/>
-                <w:sz w:val="24"/>
-                <w:szCs w:val="24"/>
-              </w:rPr>
-              <w:t xml:space="preserve">—</w:t>
+            <w:tcW w:type="dxa" w:w="2155"/>
+            <w:tcMar>
+              <w:top w:type="dxa" w:w="30"/>
+              <w:left w:type="dxa" w:w="60"/>
+              <w:bottom w:type="dxa" w:w="30"/>
+              <w:right w:type="dxa" w:w="60"/>
+            </w:tcMar>
+          </w:tcPr>
+          <w:p>
+            <w:pPr>
+              <w:spacing w:after="0" w:line="276"/>
+              <w:jc w:val="left"/>
+            </w:pPr>
+            <w:r>
+              <w:rPr>
+                <w:rFonts w:ascii="Times New Roman" w:cs="Times New Roman" w:eastAsia="Times New Roman" w:hAnsi="Times New Roman"/>
+                <w:b w:val="false"/>
+                <w:bCs w:val="false"/>
+                <w:sz w:val="24"/>
+                <w:szCs w:val="24"/>
+              </w:rPr>
+              <w:t xml:space="preserve">скрининг</w:t>
             </w:r>
           </w:p>
         </w:tc>
@@ -5136,7 +5136,7 @@
         </w:tc>
         <w:tc>
           <w:tcPr>
-            <w:tcW w:type="dxa" w:w="1500"/>
+            <w:tcW w:type="dxa" w:w="1400"/>
             <w:tcMar>
               <w:top w:type="dxa" w:w="30"/>
               <w:left w:type="dxa" w:w="60"/>
@@ -5163,28 +5163,28 @@
         </w:tc>
         <w:tc>
           <w:tcPr>
-            <w:tcW w:type="dxa" w:w="2055"/>
-            <w:tcMar>
-              <w:top w:type="dxa" w:w="30"/>
-              <w:left w:type="dxa" w:w="60"/>
-              <w:bottom w:type="dxa" w:w="30"/>
-              <w:right w:type="dxa" w:w="60"/>
-            </w:tcMar>
-          </w:tcPr>
-          <w:p>
-            <w:pPr>
-              <w:spacing w:after="0" w:line="276"/>
-              <w:jc w:val="left"/>
-            </w:pPr>
-            <w:r>
-              <w:rPr>
-                <w:rFonts w:ascii="Times New Roman" w:cs="Times New Roman" w:eastAsia="Times New Roman" w:hAnsi="Times New Roman"/>
-                <w:b w:val="false"/>
-                <w:bCs w:val="false"/>
-                <w:sz w:val="24"/>
-                <w:szCs w:val="24"/>
-              </w:rPr>
-              <w:t xml:space="preserve">—</w:t>
+            <w:tcW w:type="dxa" w:w="2155"/>
+            <w:tcMar>
+              <w:top w:type="dxa" w:w="30"/>
+              <w:left w:type="dxa" w:w="60"/>
+              <w:bottom w:type="dxa" w:w="30"/>
+              <w:right w:type="dxa" w:w="60"/>
+            </w:tcMar>
+          </w:tcPr>
+          <w:p>
+            <w:pPr>
+              <w:spacing w:after="0" w:line="276"/>
+              <w:jc w:val="left"/>
+            </w:pPr>
+            <w:r>
+              <w:rPr>
+                <w:rFonts w:ascii="Times New Roman" w:cs="Times New Roman" w:eastAsia="Times New Roman" w:hAnsi="Times New Roman"/>
+                <w:b w:val="false"/>
+                <w:bCs w:val="false"/>
+                <w:sz w:val="24"/>
+                <w:szCs w:val="24"/>
+              </w:rPr>
+              <w:t xml:space="preserve">скрининг</w:t>
             </w:r>
           </w:p>
         </w:tc>
@@ -5303,7 +5303,7 @@
         </w:tc>
         <w:tc>
           <w:tcPr>
-            <w:tcW w:type="dxa" w:w="1500"/>
+            <w:tcW w:type="dxa" w:w="1400"/>
             <w:tcMar>
               <w:top w:type="dxa" w:w="30"/>
               <w:left w:type="dxa" w:w="60"/>
@@ -5330,28 +5330,28 @@
         </w:tc>
         <w:tc>
           <w:tcPr>
-            <w:tcW w:type="dxa" w:w="2055"/>
-            <w:tcMar>
-              <w:top w:type="dxa" w:w="30"/>
-              <w:left w:type="dxa" w:w="60"/>
-              <w:bottom w:type="dxa" w:w="30"/>
-              <w:right w:type="dxa" w:w="60"/>
-            </w:tcMar>
-          </w:tcPr>
-          <w:p>
-            <w:pPr>
-              <w:spacing w:after="0" w:line="276"/>
-              <w:jc w:val="left"/>
-            </w:pPr>
-            <w:r>
-              <w:rPr>
-                <w:rFonts w:ascii="Times New Roman" w:cs="Times New Roman" w:eastAsia="Times New Roman" w:hAnsi="Times New Roman"/>
-                <w:b w:val="false"/>
-                <w:bCs w:val="false"/>
-                <w:sz w:val="24"/>
-                <w:szCs w:val="24"/>
-              </w:rPr>
-              <w:t xml:space="preserve">—</w:t>
+            <w:tcW w:type="dxa" w:w="2155"/>
+            <w:tcMar>
+              <w:top w:type="dxa" w:w="30"/>
+              <w:left w:type="dxa" w:w="60"/>
+              <w:bottom w:type="dxa" w:w="30"/>
+              <w:right w:type="dxa" w:w="60"/>
+            </w:tcMar>
+          </w:tcPr>
+          <w:p>
+            <w:pPr>
+              <w:spacing w:after="0" w:line="276"/>
+              <w:jc w:val="left"/>
+            </w:pPr>
+            <w:r>
+              <w:rPr>
+                <w:rFonts w:ascii="Times New Roman" w:cs="Times New Roman" w:eastAsia="Times New Roman" w:hAnsi="Times New Roman"/>
+                <w:b w:val="false"/>
+                <w:bCs w:val="false"/>
+                <w:sz w:val="24"/>
+                <w:szCs w:val="24"/>
+              </w:rPr>
+              <w:t xml:space="preserve">скрининг</w:t>
             </w:r>
           </w:p>
         </w:tc>
@@ -5470,55 +5470,55 @@
         </w:tc>
         <w:tc>
           <w:tcPr>
-            <w:tcW w:type="dxa" w:w="1500"/>
-            <w:tcMar>
-              <w:top w:type="dxa" w:w="30"/>
-              <w:left w:type="dxa" w:w="60"/>
-              <w:bottom w:type="dxa" w:w="30"/>
-              <w:right w:type="dxa" w:w="60"/>
-            </w:tcMar>
-          </w:tcPr>
-          <w:p>
-            <w:pPr>
-              <w:spacing w:after="0" w:line="276"/>
-              <w:jc w:val="left"/>
-            </w:pPr>
-            <w:r>
-              <w:rPr>
-                <w:rFonts w:ascii="Times New Roman" w:cs="Times New Roman" w:eastAsia="Times New Roman" w:hAnsi="Times New Roman"/>
-                <w:b w:val="false"/>
-                <w:bCs w:val="false"/>
-                <w:sz w:val="24"/>
-                <w:szCs w:val="24"/>
-              </w:rPr>
-              <w:t xml:space="preserve">НЕТ</w:t>
-            </w:r>
-          </w:p>
-        </w:tc>
-        <w:tc>
-          <w:tcPr>
-            <w:tcW w:type="dxa" w:w="2055"/>
-            <w:tcMar>
-              <w:top w:type="dxa" w:w="30"/>
-              <w:left w:type="dxa" w:w="60"/>
-              <w:bottom w:type="dxa" w:w="30"/>
-              <w:right w:type="dxa" w:w="60"/>
-            </w:tcMar>
-          </w:tcPr>
-          <w:p>
-            <w:pPr>
-              <w:spacing w:after="0" w:line="276"/>
-              <w:jc w:val="left"/>
-            </w:pPr>
-            <w:r>
-              <w:rPr>
-                <w:rFonts w:ascii="Times New Roman" w:cs="Times New Roman" w:eastAsia="Times New Roman" w:hAnsi="Times New Roman"/>
-                <w:b w:val="false"/>
-                <w:bCs w:val="false"/>
-                <w:sz w:val="24"/>
-                <w:szCs w:val="24"/>
-              </w:rPr>
-              <w:t xml:space="preserve">—</w:t>
+            <w:tcW w:type="dxa" w:w="1400"/>
+            <w:tcMar>
+              <w:top w:type="dxa" w:w="30"/>
+              <w:left w:type="dxa" w:w="60"/>
+              <w:bottom w:type="dxa" w:w="30"/>
+              <w:right w:type="dxa" w:w="60"/>
+            </w:tcMar>
+          </w:tcPr>
+          <w:p>
+            <w:pPr>
+              <w:spacing w:after="0" w:line="276"/>
+              <w:jc w:val="left"/>
+            </w:pPr>
+            <w:r>
+              <w:rPr>
+                <w:rFonts w:ascii="Times New Roman" w:cs="Times New Roman" w:eastAsia="Times New Roman" w:hAnsi="Times New Roman"/>
+                <w:b w:val="false"/>
+                <w:bCs w:val="false"/>
+                <w:sz w:val="24"/>
+                <w:szCs w:val="24"/>
+              </w:rPr>
+              <w:t xml:space="preserve">нет</w:t>
+            </w:r>
+          </w:p>
+        </w:tc>
+        <w:tc>
+          <w:tcPr>
+            <w:tcW w:type="dxa" w:w="2155"/>
+            <w:tcMar>
+              <w:top w:type="dxa" w:w="30"/>
+              <w:left w:type="dxa" w:w="60"/>
+              <w:bottom w:type="dxa" w:w="30"/>
+              <w:right w:type="dxa" w:w="60"/>
+            </w:tcMar>
+          </w:tcPr>
+          <w:p>
+            <w:pPr>
+              <w:spacing w:after="0" w:line="276"/>
+              <w:jc w:val="left"/>
+            </w:pPr>
+            <w:r>
+              <w:rPr>
+                <w:rFonts w:ascii="Times New Roman" w:cs="Times New Roman" w:eastAsia="Times New Roman" w:hAnsi="Times New Roman"/>
+                <w:b w:val="false"/>
+                <w:bCs w:val="false"/>
+                <w:sz w:val="24"/>
+                <w:szCs w:val="24"/>
+              </w:rPr>
+              <w:t xml:space="preserve">скрининг</w:t>
             </w:r>
           </w:p>
         </w:tc>
@@ -5637,55 +5637,55 @@
         </w:tc>
         <w:tc>
           <w:tcPr>
-            <w:tcW w:type="dxa" w:w="1500"/>
-            <w:tcMar>
-              <w:top w:type="dxa" w:w="30"/>
-              <w:left w:type="dxa" w:w="60"/>
-              <w:bottom w:type="dxa" w:w="30"/>
-              <w:right w:type="dxa" w:w="60"/>
-            </w:tcMar>
-          </w:tcPr>
-          <w:p>
-            <w:pPr>
-              <w:spacing w:after="0" w:line="276"/>
-              <w:jc w:val="left"/>
-            </w:pPr>
-            <w:r>
-              <w:rPr>
-                <w:rFonts w:ascii="Times New Roman" w:cs="Times New Roman" w:eastAsia="Times New Roman" w:hAnsi="Times New Roman"/>
-                <w:b w:val="false"/>
-                <w:bCs w:val="false"/>
-                <w:sz w:val="24"/>
-                <w:szCs w:val="24"/>
-              </w:rPr>
-              <w:t xml:space="preserve">НЕТ</w:t>
-            </w:r>
-          </w:p>
-        </w:tc>
-        <w:tc>
-          <w:tcPr>
-            <w:tcW w:type="dxa" w:w="2055"/>
-            <w:tcMar>
-              <w:top w:type="dxa" w:w="30"/>
-              <w:left w:type="dxa" w:w="60"/>
-              <w:bottom w:type="dxa" w:w="30"/>
-              <w:right w:type="dxa" w:w="60"/>
-            </w:tcMar>
-          </w:tcPr>
-          <w:p>
-            <w:pPr>
-              <w:spacing w:after="0" w:line="276"/>
-              <w:jc w:val="left"/>
-            </w:pPr>
-            <w:r>
-              <w:rPr>
-                <w:rFonts w:ascii="Times New Roman" w:cs="Times New Roman" w:eastAsia="Times New Roman" w:hAnsi="Times New Roman"/>
-                <w:b w:val="false"/>
-                <w:bCs w:val="false"/>
-                <w:sz w:val="24"/>
-                <w:szCs w:val="24"/>
-              </w:rPr>
-              <w:t xml:space="preserve">—</w:t>
+            <w:tcW w:type="dxa" w:w="1400"/>
+            <w:tcMar>
+              <w:top w:type="dxa" w:w="30"/>
+              <w:left w:type="dxa" w:w="60"/>
+              <w:bottom w:type="dxa" w:w="30"/>
+              <w:right w:type="dxa" w:w="60"/>
+            </w:tcMar>
+          </w:tcPr>
+          <w:p>
+            <w:pPr>
+              <w:spacing w:after="0" w:line="276"/>
+              <w:jc w:val="left"/>
+            </w:pPr>
+            <w:r>
+              <w:rPr>
+                <w:rFonts w:ascii="Times New Roman" w:cs="Times New Roman" w:eastAsia="Times New Roman" w:hAnsi="Times New Roman"/>
+                <w:b w:val="false"/>
+                <w:bCs w:val="false"/>
+                <w:sz w:val="24"/>
+                <w:szCs w:val="24"/>
+              </w:rPr>
+              <w:t xml:space="preserve">нет</w:t>
+            </w:r>
+          </w:p>
+        </w:tc>
+        <w:tc>
+          <w:tcPr>
+            <w:tcW w:type="dxa" w:w="2155"/>
+            <w:tcMar>
+              <w:top w:type="dxa" w:w="30"/>
+              <w:left w:type="dxa" w:w="60"/>
+              <w:bottom w:type="dxa" w:w="30"/>
+              <w:right w:type="dxa" w:w="60"/>
+            </w:tcMar>
+          </w:tcPr>
+          <w:p>
+            <w:pPr>
+              <w:spacing w:after="0" w:line="276"/>
+              <w:jc w:val="left"/>
+            </w:pPr>
+            <w:r>
+              <w:rPr>
+                <w:rFonts w:ascii="Times New Roman" w:cs="Times New Roman" w:eastAsia="Times New Roman" w:hAnsi="Times New Roman"/>
+                <w:b w:val="false"/>
+                <w:bCs w:val="false"/>
+                <w:sz w:val="24"/>
+                <w:szCs w:val="24"/>
+              </w:rPr>
+              <w:t xml:space="preserve">полное</w:t>
             </w:r>
           </w:p>
         </w:tc>
@@ -5804,7 +5804,7 @@
         </w:tc>
         <w:tc>
           <w:tcPr>
-            <w:tcW w:type="dxa" w:w="1500"/>
+            <w:tcW w:type="dxa" w:w="1400"/>
             <w:tcMar>
               <w:top w:type="dxa" w:w="30"/>
               <w:left w:type="dxa" w:w="60"/>
@@ -5831,28 +5831,28 @@
         </w:tc>
         <w:tc>
           <w:tcPr>
-            <w:tcW w:type="dxa" w:w="2055"/>
-            <w:tcMar>
-              <w:top w:type="dxa" w:w="30"/>
-              <w:left w:type="dxa" w:w="60"/>
-              <w:bottom w:type="dxa" w:w="30"/>
-              <w:right w:type="dxa" w:w="60"/>
-            </w:tcMar>
-          </w:tcPr>
-          <w:p>
-            <w:pPr>
-              <w:spacing w:after="0" w:line="276"/>
-              <w:jc w:val="left"/>
-            </w:pPr>
-            <w:r>
-              <w:rPr>
-                <w:rFonts w:ascii="Times New Roman" w:cs="Times New Roman" w:eastAsia="Times New Roman" w:hAnsi="Times New Roman"/>
-                <w:b w:val="false"/>
-                <w:bCs w:val="false"/>
-                <w:sz w:val="24"/>
-                <w:szCs w:val="24"/>
-              </w:rPr>
-              <w:t xml:space="preserve">—</w:t>
+            <w:tcW w:type="dxa" w:w="2155"/>
+            <w:tcMar>
+              <w:top w:type="dxa" w:w="30"/>
+              <w:left w:type="dxa" w:w="60"/>
+              <w:bottom w:type="dxa" w:w="30"/>
+              <w:right w:type="dxa" w:w="60"/>
+            </w:tcMar>
+          </w:tcPr>
+          <w:p>
+            <w:pPr>
+              <w:spacing w:after="0" w:line="276"/>
+              <w:jc w:val="left"/>
+            </w:pPr>
+            <w:r>
+              <w:rPr>
+                <w:rFonts w:ascii="Times New Roman" w:cs="Times New Roman" w:eastAsia="Times New Roman" w:hAnsi="Times New Roman"/>
+                <w:b w:val="false"/>
+                <w:bCs w:val="false"/>
+                <w:sz w:val="24"/>
+                <w:szCs w:val="24"/>
+              </w:rPr>
+              <w:t xml:space="preserve">выбрана</w:t>
             </w:r>
           </w:p>
         </w:tc>
@@ -5971,7 +5971,7 @@
         </w:tc>
         <w:tc>
           <w:tcPr>
-            <w:tcW w:type="dxa" w:w="1500"/>
+            <w:tcW w:type="dxa" w:w="1400"/>
             <w:tcMar>
               <w:top w:type="dxa" w:w="30"/>
               <w:left w:type="dxa" w:w="60"/>
@@ -5998,28 +5998,28 @@
         </w:tc>
         <w:tc>
           <w:tcPr>
-            <w:tcW w:type="dxa" w:w="2055"/>
-            <w:tcMar>
-              <w:top w:type="dxa" w:w="30"/>
-              <w:left w:type="dxa" w:w="60"/>
-              <w:bottom w:type="dxa" w:w="30"/>
-              <w:right w:type="dxa" w:w="60"/>
-            </w:tcMar>
-          </w:tcPr>
-          <w:p>
-            <w:pPr>
-              <w:spacing w:after="0" w:line="276"/>
-              <w:jc w:val="left"/>
-            </w:pPr>
-            <w:r>
-              <w:rPr>
-                <w:rFonts w:ascii="Times New Roman" w:cs="Times New Roman" w:eastAsia="Times New Roman" w:hAnsi="Times New Roman"/>
-                <w:b w:val="false"/>
-                <w:bCs w:val="false"/>
-                <w:sz w:val="24"/>
-                <w:szCs w:val="24"/>
-              </w:rPr>
-              <w:t xml:space="preserve">—</w:t>
+            <w:tcW w:type="dxa" w:w="2155"/>
+            <w:tcMar>
+              <w:top w:type="dxa" w:w="30"/>
+              <w:left w:type="dxa" w:w="60"/>
+              <w:bottom w:type="dxa" w:w="30"/>
+              <w:right w:type="dxa" w:w="60"/>
+            </w:tcMar>
+          </w:tcPr>
+          <w:p>
+            <w:pPr>
+              <w:spacing w:after="0" w:line="276"/>
+              <w:jc w:val="left"/>
+            </w:pPr>
+            <w:r>
+              <w:rPr>
+                <w:rFonts w:ascii="Times New Roman" w:cs="Times New Roman" w:eastAsia="Times New Roman" w:hAnsi="Times New Roman"/>
+                <w:b w:val="false"/>
+                <w:bCs w:val="false"/>
+                <w:sz w:val="24"/>
+                <w:szCs w:val="24"/>
+              </w:rPr>
+              <w:t xml:space="preserve">полное</w:t>
             </w:r>
           </w:p>
         </w:tc>
@@ -6138,7 +6138,7 @@
         </w:tc>
         <w:tc>
           <w:tcPr>
-            <w:tcW w:type="dxa" w:w="1500"/>
+            <w:tcW w:type="dxa" w:w="1400"/>
             <w:tcMar>
               <w:top w:type="dxa" w:w="30"/>
               <w:left w:type="dxa" w:w="60"/>
@@ -6165,28 +6165,28 @@
         </w:tc>
         <w:tc>
           <w:tcPr>
-            <w:tcW w:type="dxa" w:w="2055"/>
-            <w:tcMar>
-              <w:top w:type="dxa" w:w="30"/>
-              <w:left w:type="dxa" w:w="60"/>
-              <w:bottom w:type="dxa" w:w="30"/>
-              <w:right w:type="dxa" w:w="60"/>
-            </w:tcMar>
-          </w:tcPr>
-          <w:p>
-            <w:pPr>
-              <w:spacing w:after="0" w:line="276"/>
-              <w:jc w:val="left"/>
-            </w:pPr>
-            <w:r>
-              <w:rPr>
-                <w:rFonts w:ascii="Times New Roman" w:cs="Times New Roman" w:eastAsia="Times New Roman" w:hAnsi="Times New Roman"/>
-                <w:b w:val="false"/>
-                <w:bCs w:val="false"/>
-                <w:sz w:val="24"/>
-                <w:szCs w:val="24"/>
-              </w:rPr>
-              <w:t xml:space="preserve">—</w:t>
+            <w:tcW w:type="dxa" w:w="2155"/>
+            <w:tcMar>
+              <w:top w:type="dxa" w:w="30"/>
+              <w:left w:type="dxa" w:w="60"/>
+              <w:bottom w:type="dxa" w:w="30"/>
+              <w:right w:type="dxa" w:w="60"/>
+            </w:tcMar>
+          </w:tcPr>
+          <w:p>
+            <w:pPr>
+              <w:spacing w:after="0" w:line="276"/>
+              <w:jc w:val="left"/>
+            </w:pPr>
+            <w:r>
+              <w:rPr>
+                <w:rFonts w:ascii="Times New Roman" w:cs="Times New Roman" w:eastAsia="Times New Roman" w:hAnsi="Times New Roman"/>
+                <w:b w:val="false"/>
+                <w:bCs w:val="false"/>
+                <w:sz w:val="24"/>
+                <w:szCs w:val="24"/>
+              </w:rPr>
+              <w:t xml:space="preserve">повтор</w:t>
             </w:r>
           </w:p>
         </w:tc>
@@ -6989,7 +6989,23 @@
           <w:sz w:val="24"/>
           <w:szCs w:val="24"/>
         </w:rPr>
-        <w:t xml:space="preserve">Рисунок 1 - трасса перелёта НОО -&gt; гало у L2 (plot_traj.py по числам result.txt): наклон плоскости выведения 28,2°, конус полутени Земли и порог Az_min</w:t>
+        <w:t xml:space="preserve">Рисунки 1-3 - геометрия трассы: вид сверху на эклиптике, разрез xz с конусом</w:t>
+      </w:r>
+    </w:p>
+    <w:p>
+      <w:pPr>
+        <w:spacing w:after="60" w:before="60" w:line="360"/>
+        <w:jc w:val="center"/>
+      </w:pPr>
+      <w:r>
+        <w:rPr>
+          <w:rFonts w:ascii="Times New Roman" w:cs="Times New Roman" w:eastAsia="Times New Roman" w:hAnsi="Times New Roman"/>
+          <w:i/>
+          <w:iCs/>
+          <w:sz w:val="24"/>
+          <w:szCs w:val="24"/>
+        </w:rPr>
+        <w:t xml:space="preserve">полутени Земли и порогом Az_min, и пространственный вид (plot_traj.py, рис. 1)</w:t>
       </w:r>
     </w:p>
     <w:p>
@@ -7000,7 +7016,7 @@
       <w:r>
         <w:drawing>
           <wp:inline distT="0" distB="0" distL="0" distR="0">
-            <wp:extent cx="5905500" cy="2647950"/>
+            <wp:extent cx="5715000" cy="4286250"/>
             <wp:effectExtent t="0" r="0" b="0" l="0"/>
             <wp:docPr id="1" name=""/>
             <wp:cNvGraphicFramePr>
@@ -7025,7 +7041,99 @@
                   <pic:spPr bwMode="auto">
                     <a:xfrm>
                       <a:off x="0" y="0"/>
-                      <a:ext cx="5905500" cy="2647950"/>
+                      <a:ext cx="5715000" cy="4286250"/>
+                    </a:xfrm>
+                    <a:prstGeom prst="rect">
+                      <a:avLst/>
+                    </a:prstGeom>
+                  </pic:spPr>
+                </pic:pic>
+              </a:graphicData>
+            </a:graphic>
+          </wp:inline>
+        </w:drawing>
+      </w:r>
+    </w:p>
+    <w:p>
+      <w:pPr>
+        <w:spacing w:after="60" w:before="60" w:line="360"/>
+        <w:jc w:val="center"/>
+      </w:pPr>
+      <w:r>
+        <w:drawing>
+          <wp:inline distT="0" distB="0" distL="0" distR="0">
+            <wp:extent cx="5715000" cy="3676650"/>
+            <wp:effectExtent t="0" r="0" b="0" l="0"/>
+            <wp:docPr id="2" name=""/>
+            <wp:cNvGraphicFramePr>
+              <a:graphicFrameLocks xmlns:a="http://schemas.openxmlformats.org/drawingml/2006/main" noChangeAspect="1"/>
+            </wp:cNvGraphicFramePr>
+            <a:graphic xmlns:a="http://schemas.openxmlformats.org/drawingml/2006/main">
+              <a:graphicData uri="http://schemas.openxmlformats.org/drawingml/2006/picture">
+                <pic:pic xmlns:pic="http://schemas.openxmlformats.org/drawingml/2006/picture">
+                  <pic:nvPicPr>
+                    <pic:cNvPr id="0" name="" descr=""/>
+                    <pic:cNvPicPr>
+                      <a:picLocks noChangeAspect="1" noChangeArrowheads="1"/>
+                    </pic:cNvPicPr>
+                  </pic:nvPicPr>
+                  <pic:blipFill>
+                    <a:blip r:embed="rId8" cstate="none"/>
+                    <a:srcRect/>
+                    <a:stretch>
+                      <a:fillRect/>
+                    </a:stretch>
+                  </pic:blipFill>
+                  <pic:spPr bwMode="auto">
+                    <a:xfrm>
+                      <a:off x="0" y="0"/>
+                      <a:ext cx="5715000" cy="3676650"/>
+                    </a:xfrm>
+                    <a:prstGeom prst="rect">
+                      <a:avLst/>
+                    </a:prstGeom>
+                  </pic:spPr>
+                </pic:pic>
+              </a:graphicData>
+            </a:graphic>
+          </wp:inline>
+        </w:drawing>
+      </w:r>
+    </w:p>
+    <w:p>
+      <w:pPr>
+        <w:spacing w:after="60" w:before="60" w:line="360"/>
+        <w:jc w:val="center"/>
+      </w:pPr>
+      <w:r>
+        <w:drawing>
+          <wp:inline distT="0" distB="0" distL="0" distR="0">
+            <wp:extent cx="5334000" cy="3810000"/>
+            <wp:effectExtent t="0" r="0" b="0" l="0"/>
+            <wp:docPr id="3" name=""/>
+            <wp:cNvGraphicFramePr>
+              <a:graphicFrameLocks xmlns:a="http://schemas.openxmlformats.org/drawingml/2006/main" noChangeAspect="1"/>
+            </wp:cNvGraphicFramePr>
+            <a:graphic xmlns:a="http://schemas.openxmlformats.org/drawingml/2006/main">
+              <a:graphicData uri="http://schemas.openxmlformats.org/drawingml/2006/picture">
+                <pic:pic xmlns:pic="http://schemas.openxmlformats.org/drawingml/2006/picture">
+                  <pic:nvPicPr>
+                    <pic:cNvPr id="0" name="" descr=""/>
+                    <pic:cNvPicPr>
+                      <a:picLocks noChangeAspect="1" noChangeArrowheads="1"/>
+                    </pic:cNvPicPr>
+                  </pic:nvPicPr>
+                  <pic:blipFill>
+                    <a:blip r:embed="rId9" cstate="none"/>
+                    <a:srcRect/>
+                    <a:stretch>
+                      <a:fillRect/>
+                    </a:stretch>
+                  </pic:blipFill>
+                  <pic:spPr bwMode="auto">
+                    <a:xfrm>
+                      <a:off x="0" y="0"/>
+                      <a:ext cx="5334000" cy="3810000"/>
                     </a:xfrm>
                     <a:prstGeom prst="rect">
                       <a:avLst/>
@@ -7051,7 +7159,7 @@
           <w:sz w:val="24"/>
           <w:szCs w:val="24"/>
         </w:rPr>
-        <w:t xml:space="preserve">Рисунок 2 - данные по этой же трассе: ξ(t), |v|(t) с точкой касания орбиты,</w:t>
+        <w:t xml:space="preserve">Рисунки 4-5 - данные по этой же трассе: ход ξ(t) и |v|(t) со скоростью целевой</w:t>
       </w:r>
     </w:p>
     <w:p>
@@ -7067,7 +7175,7 @@
           <w:sz w:val="24"/>
           <w:szCs w:val="24"/>
         </w:rPr>
-        <w:t xml:space="preserve">затенение на перелёте и проектные числа, прочитанные из result.txt</w:t>
+        <w:t xml:space="preserve">орбиты в точке касания (красная штрих-пунктирная) и затенение на перелёте</w:t>
       </w:r>
     </w:p>
     <w:p>
@@ -7078,9 +7186,9 @@
       <w:r>
         <w:drawing>
           <wp:inline distT="0" distB="0" distL="0" distR="0">
-            <wp:extent cx="5334000" cy="3552825"/>
+            <wp:extent cx="4476750" cy="3733800"/>
             <wp:effectExtent t="0" r="0" b="0" l="0"/>
-            <wp:docPr id="2" name=""/>
+            <wp:docPr id="4" name=""/>
             <wp:cNvGraphicFramePr>
               <a:graphicFrameLocks xmlns:a="http://schemas.openxmlformats.org/drawingml/2006/main" noChangeAspect="1"/>
             </wp:cNvGraphicFramePr>
@@ -7094,7 +7202,7 @@
                     </pic:cNvPicPr>
                   </pic:nvPicPr>
                   <pic:blipFill>
-                    <a:blip r:embed="rId8" cstate="none"/>
+                    <a:blip r:embed="rId10" cstate="none"/>
                     <a:srcRect/>
                     <a:stretch>
                       <a:fillRect/>
@@ -7103,7 +7211,53 @@
                   <pic:spPr bwMode="auto">
                     <a:xfrm>
                       <a:off x="0" y="0"/>
-                      <a:ext cx="5334000" cy="3552825"/>
+                      <a:ext cx="4476750" cy="3733800"/>
+                    </a:xfrm>
+                    <a:prstGeom prst="rect">
+                      <a:avLst/>
+                    </a:prstGeom>
+                  </pic:spPr>
+                </pic:pic>
+              </a:graphicData>
+            </a:graphic>
+          </wp:inline>
+        </w:drawing>
+      </w:r>
+    </w:p>
+    <w:p>
+      <w:pPr>
+        <w:spacing w:after="60" w:before="60" w:line="360"/>
+        <w:jc w:val="center"/>
+      </w:pPr>
+      <w:r>
+        <w:drawing>
+          <wp:inline distT="0" distB="0" distL="0" distR="0">
+            <wp:extent cx="5715000" cy="3238500"/>
+            <wp:effectExtent t="0" r="0" b="0" l="0"/>
+            <wp:docPr id="5" name=""/>
+            <wp:cNvGraphicFramePr>
+              <a:graphicFrameLocks xmlns:a="http://schemas.openxmlformats.org/drawingml/2006/main" noChangeAspect="1"/>
+            </wp:cNvGraphicFramePr>
+            <a:graphic xmlns:a="http://schemas.openxmlformats.org/drawingml/2006/main">
+              <a:graphicData uri="http://schemas.openxmlformats.org/drawingml/2006/picture">
+                <pic:pic xmlns:pic="http://schemas.openxmlformats.org/drawingml/2006/picture">
+                  <pic:nvPicPr>
+                    <pic:cNvPr id="0" name="" descr=""/>
+                    <pic:cNvPicPr>
+                      <a:picLocks noChangeAspect="1" noChangeArrowheads="1"/>
+                    </pic:cNvPicPr>
+                  </pic:nvPicPr>
+                  <pic:blipFill>
+                    <a:blip r:embed="rId11" cstate="none"/>
+                    <a:srcRect/>
+                    <a:stretch>
+                      <a:fillRect/>
+                    </a:stretch>
+                  </pic:blipFill>
+                  <pic:spPr bwMode="auto">
+                    <a:xfrm>
+                      <a:off x="0" y="0"/>
+                      <a:ext cx="5715000" cy="3238500"/>
                     </a:xfrm>
                     <a:prstGeom prst="rect">
                       <a:avLst/>
@@ -12181,7 +12335,7 @@
                 <w:sz w:val="24"/>
                 <w:szCs w:val="24"/>
               </w:rPr>
-              <w:t xml:space="preserve">трасса и целевая орбита: то же интегрирование модели, числа из result.txt; вывод -&gt; traj.png (геометрия, рис. 1) и traj_data.png (ξ(t), |v|(t), тени, числа, рис. 2)</w:t>
+              <w:t xml:space="preserve">трасса и целевая орбита: то же интегрирование модели, числа из result.txt (блок AIM); вывод — пять рисунков: fig1_plan / fig1_xz / fig1_3d (рис. 1-3, геометрия) и fig2_xi_v / fig2_shadow (рис. 4-5, данные по трассе)</w:t>
             </w:r>
           </w:p>
         </w:tc>

</xml_diff>

<commit_message>
Per-figure captions ("Рисунок 1..5") instead of one group label
The numbering only existed inside the PNG titles, so the text of the report could not be
searched or cross-referenced by figure. Each of the five inserts now gets its own caption
(figure 2 quotes the protocol's tilt and figure 4 the energy verdict), and the report
settles at 15 pages.
</commit_message>
<xml_diff>
--- a/Raschet_L2_perelet.docx
+++ b/Raschet_L2_perelet.docx
@@ -6989,23 +6989,7 @@
           <w:sz w:val="24"/>
           <w:szCs w:val="24"/>
         </w:rPr>
-        <w:t xml:space="preserve">Рисунки 1-3 - геометрия трассы: вид сверху на эклиптике, разрез xz с конусом</w:t>
-      </w:r>
-    </w:p>
-    <w:p>
-      <w:pPr>
-        <w:spacing w:after="60" w:before="60" w:line="360"/>
-        <w:jc w:val="center"/>
-      </w:pPr>
-      <w:r>
-        <w:rPr>
-          <w:rFonts w:ascii="Times New Roman" w:cs="Times New Roman" w:eastAsia="Times New Roman" w:hAnsi="Times New Roman"/>
-          <w:i/>
-          <w:iCs/>
-          <w:sz w:val="24"/>
-          <w:szCs w:val="24"/>
-        </w:rPr>
-        <w:t xml:space="preserve">полутени Земли и порогом Az_min, и пространственный вид (plot_traj.py, рис. 1)</w:t>
+        <w:t xml:space="preserve">Рисунок 1 - трасса перелёта и целевое гало: вид сверху на эклиптике</w:t>
       </w:r>
     </w:p>
     <w:p>
@@ -7060,6 +7044,38 @@
         <w:jc w:val="center"/>
       </w:pPr>
       <w:r>
+        <w:rPr>
+          <w:rFonts w:ascii="Times New Roman" w:cs="Times New Roman" w:eastAsia="Times New Roman" w:hAnsi="Times New Roman"/>
+          <w:i/>
+          <w:iCs/>
+          <w:sz w:val="24"/>
+          <w:szCs w:val="24"/>
+        </w:rPr>
+        <w:t xml:space="preserve">Рисунок 2 - разрез xz: наклон плоскости выведения 28,2° к эклиптике,</w:t>
+      </w:r>
+    </w:p>
+    <w:p>
+      <w:pPr>
+        <w:spacing w:after="60" w:before="60" w:line="360"/>
+        <w:jc w:val="center"/>
+      </w:pPr>
+      <w:r>
+        <w:rPr>
+          <w:rFonts w:ascii="Times New Roman" w:cs="Times New Roman" w:eastAsia="Times New Roman" w:hAnsi="Times New Roman"/>
+          <w:i/>
+          <w:iCs/>
+          <w:sz w:val="24"/>
+          <w:szCs w:val="24"/>
+        </w:rPr>
+        <w:t xml:space="preserve">конус полутени Земли и порог выхода из тени Az_min</w:t>
+      </w:r>
+    </w:p>
+    <w:p>
+      <w:pPr>
+        <w:spacing w:after="60" w:before="60" w:line="360"/>
+        <w:jc w:val="center"/>
+      </w:pPr>
+      <w:r>
         <w:drawing>
           <wp:inline distT="0" distB="0" distL="0" distR="0">
             <wp:extent cx="5715000" cy="3676650"/>
@@ -7098,6 +7114,22 @@
             </a:graphic>
           </wp:inline>
         </w:drawing>
+      </w:r>
+    </w:p>
+    <w:p>
+      <w:pPr>
+        <w:spacing w:after="60" w:before="60" w:line="360"/>
+        <w:jc w:val="center"/>
+      </w:pPr>
+      <w:r>
+        <w:rPr>
+          <w:rFonts w:ascii="Times New Roman" w:cs="Times New Roman" w:eastAsia="Times New Roman" w:hAnsi="Times New Roman"/>
+          <w:i/>
+          <w:iCs/>
+          <w:sz w:val="24"/>
+          <w:szCs w:val="24"/>
+        </w:rPr>
+        <w:t xml:space="preserve">Рисунок 3 - та же трасса и целевая орбита в пространстве</w:t>
       </w:r>
     </w:p>
     <w:p>
@@ -7159,7 +7191,7 @@
           <w:sz w:val="24"/>
           <w:szCs w:val="24"/>
         </w:rPr>
-        <w:t xml:space="preserve">Рисунки 4-5 - данные по этой же трассе: ход ξ(t) и |v|(t) со скоростью целевой</w:t>
+        <w:t xml:space="preserve">Рисунок 4 - ход перелёта: ξ(t) и |v|(t) против скорости целевой орбиты</w:t>
       </w:r>
     </w:p>
     <w:p>
@@ -7175,7 +7207,7 @@
           <w:sz w:val="24"/>
           <w:szCs w:val="24"/>
         </w:rPr>
-        <w:t xml:space="preserve">орбиты в точке касания (красная штрих-пунктирная) и затенение на перелёте</w:t>
+        <w:t xml:space="preserve">в точке касания (штрих-пунктир); вход по энергии тормозной</w:t>
       </w:r>
     </w:p>
     <w:p>
@@ -7222,6 +7254,38 @@
             </a:graphic>
           </wp:inline>
         </w:drawing>
+      </w:r>
+    </w:p>
+    <w:p>
+      <w:pPr>
+        <w:spacing w:after="60" w:before="60" w:line="360"/>
+        <w:jc w:val="center"/>
+      </w:pPr>
+      <w:r>
+        <w:rPr>
+          <w:rFonts w:ascii="Times New Roman" w:cs="Times New Roman" w:eastAsia="Times New Roman" w:hAnsi="Times New Roman"/>
+          <w:i/>
+          <w:iCs/>
+          <w:sz w:val="24"/>
+          <w:szCs w:val="24"/>
+        </w:rPr>
+        <w:t xml:space="preserve">Рисунок 5 - затенение на перелёте: ρ(t) и радиус полутени r_pen(ξ)</w:t>
+      </w:r>
+    </w:p>
+    <w:p>
+      <w:pPr>
+        <w:spacing w:after="60" w:before="60" w:line="360"/>
+        <w:jc w:val="center"/>
+      </w:pPr>
+      <w:r>
+        <w:rPr>
+          <w:rFonts w:ascii="Times New Roman" w:cs="Times New Roman" w:eastAsia="Times New Roman" w:hAnsi="Times New Roman"/>
+          <w:i/>
+          <w:iCs/>
+          <w:sz w:val="24"/>
+          <w:szCs w:val="24"/>
+        </w:rPr>
+        <w:t xml:space="preserve">(логарифмическая шкала; точка включения 1-го импульса - в тени Земли)</w:t>
       </w:r>
     </w:p>
     <w:p>

</xml_diff>

<commit_message>
Each panel its own figure: seven instead of four
Figures 2-4 carried two panels each, which put the labels back at the size the split was
meant to avoid. Now every subject is a canvas of its own:

  1 fig1_overview  whole transfer, top view          5 fig5_shadow   rho(t) vs r_pen(t)
  2 fig2_start     first 150 тыс. km from the Earth  6 fig6_xi       xi(t), sunward stretch
  3 fig3_entry     final approach and entry point    7 fig7_v        |v|(t) vs the halo speed
  4 fig4_xz        xz cut, penumbra cone, Az_min

Every figure keeps its own axis window chosen from the measured data ranges, and the
panel asserts became per-figure ones (start leg has 900 dense samples inside the frame,
the approach lies inside its window, rho and |v| inside their log scales). Captions
"Рисунок 1..7" in the text; 18 pages, two figures per page with their captions.
</commit_message>
<xml_diff>
--- a/Raschet_L2_perelet.docx
+++ b/Raschet_L2_perelet.docx
@@ -7837,7 +7837,7 @@
           <w:sz w:val="24"/>
           <w:szCs w:val="24"/>
         </w:rPr>
-        <w:t xml:space="preserve">Рисунок 2 - два прицельных зума: а) первые 150 тыс. км пути от Земли</w:t>
+        <w:t xml:space="preserve">Рисунок 2 - старт: НОО 200 км и первые 150 тыс. км пути (тот же</w:t>
       </w:r>
     </w:p>
     <w:p>
@@ -7853,7 +7853,7 @@
           <w:sz w:val="24"/>
           <w:szCs w:val="24"/>
         </w:rPr>
-        <w:t xml:space="preserve">(НОО и ночная сторона старта); б) подлёт к гало и точка входа</w:t>
+        <w:t xml:space="preserve">участок трассы, проинтегрированный плотно; включение - с ночной стороны)</w:t>
       </w:r>
     </w:p>
     <w:p>
@@ -7864,7 +7864,7 @@
       <w:r>
         <w:drawing>
           <wp:inline distT="0" distB="0" distL="0" distR="0">
-            <wp:extent cx="6477000" cy="3028950"/>
+            <wp:extent cx="4762500" cy="4210050"/>
             <wp:effectExtent t="0" r="0" b="0" l="0"/>
             <wp:docPr id="2" name=""/>
             <wp:cNvGraphicFramePr>
@@ -7889,7 +7889,7 @@
                   <pic:spPr bwMode="auto">
                     <a:xfrm>
                       <a:off x="0" y="0"/>
-                      <a:ext cx="6477000" cy="3028950"/>
+                      <a:ext cx="4762500" cy="4210050"/>
                     </a:xfrm>
                     <a:prstGeom prst="rect">
                       <a:avLst/>
@@ -7915,7 +7915,7 @@
           <w:sz w:val="24"/>
           <w:szCs w:val="24"/>
         </w:rPr>
-        <w:t xml:space="preserve">Рисунок 3 - тень: а) разрез xz, конус полутени и порог Az_min;</w:t>
+        <w:t xml:space="preserve">Рисунок 3 - цель: гало и подлёт к нему; звезда - точка входа</w:t>
       </w:r>
     </w:p>
     <w:p>
@@ -7931,7 +7931,7 @@
           <w:sz w:val="24"/>
           <w:szCs w:val="24"/>
         </w:rPr>
-        <w:t xml:space="preserve">б) ρ(t) против границы полутени (лог-шкала)</w:t>
+        <w:t xml:space="preserve">(промах 8 км при пороге 500 км)</w:t>
       </w:r>
     </w:p>
     <w:p>
@@ -7942,7 +7942,7 @@
       <w:r>
         <w:drawing>
           <wp:inline distT="0" distB="0" distL="0" distR="0">
-            <wp:extent cx="6477000" cy="2752725"/>
+            <wp:extent cx="5334000" cy="3914775"/>
             <wp:effectExtent t="0" r="0" b="0" l="0"/>
             <wp:docPr id="3" name=""/>
             <wp:cNvGraphicFramePr>
@@ -7967,7 +7967,7 @@
                   <pic:spPr bwMode="auto">
                     <a:xfrm>
                       <a:off x="0" y="0"/>
-                      <a:ext cx="6477000" cy="2752725"/>
+                      <a:ext cx="5334000" cy="3914775"/>
                     </a:xfrm>
                     <a:prstGeom prst="rect">
                       <a:avLst/>
@@ -7993,7 +7993,7 @@
           <w:sz w:val="24"/>
           <w:szCs w:val="24"/>
         </w:rPr>
-        <w:t xml:space="preserve">Рисунок 4 - ход перелёта: ξ(t) и |v|(t) против скорости целевой</w:t>
+        <w:t xml:space="preserve">Рисунок 4 - разрез xz: трасса и гало над конусом полутени Земли;</w:t>
       </w:r>
     </w:p>
     <w:p>
@@ -8009,7 +8009,7 @@
           <w:sz w:val="24"/>
           <w:szCs w:val="24"/>
         </w:rPr>
-        <w:t xml:space="preserve">орбиты в точке касания (штрих-пунктир); вход тормозной</w:t>
+        <w:t xml:space="preserve">пунктир - расчитанный порог выхода из тени Az_min</w:t>
       </w:r>
     </w:p>
     <w:p>
@@ -8020,7 +8020,7 @@
       <w:r>
         <w:drawing>
           <wp:inline distT="0" distB="0" distL="0" distR="0">
-            <wp:extent cx="4762500" cy="4333875"/>
+            <wp:extent cx="6286500" cy="3714750"/>
             <wp:effectExtent t="0" r="0" b="0" l="0"/>
             <wp:docPr id="4" name=""/>
             <wp:cNvGraphicFramePr>
@@ -8045,7 +8045,241 @@
                   <pic:spPr bwMode="auto">
                     <a:xfrm>
                       <a:off x="0" y="0"/>
-                      <a:ext cx="4762500" cy="4333875"/>
+                      <a:ext cx="6286500" cy="3714750"/>
+                    </a:xfrm>
+                    <a:prstGeom prst="rect">
+                      <a:avLst/>
+                    </a:prstGeom>
+                  </pic:spPr>
+                </pic:pic>
+              </a:graphicData>
+            </a:graphic>
+          </wp:inline>
+        </w:drawing>
+      </w:r>
+    </w:p>
+    <w:p>
+      <w:pPr>
+        <w:spacing w:after="60" w:before="60" w:line="360"/>
+        <w:jc w:val="center"/>
+      </w:pPr>
+      <w:r>
+        <w:rPr>
+          <w:rFonts w:ascii="Times New Roman" w:cs="Times New Roman" w:eastAsia="Times New Roman" w:hAnsi="Times New Roman"/>
+          <w:i/>
+          <w:iCs/>
+          <w:sz w:val="24"/>
+          <w:szCs w:val="24"/>
+        </w:rPr>
+        <w:t xml:space="preserve">Рисунок 5 - затенение на перелёте: rho(t) против границы полутени</w:t>
+      </w:r>
+    </w:p>
+    <w:p>
+      <w:pPr>
+        <w:spacing w:after="60" w:before="60" w:line="360"/>
+        <w:jc w:val="center"/>
+      </w:pPr>
+      <w:r>
+        <w:rPr>
+          <w:rFonts w:ascii="Times New Roman" w:cs="Times New Roman" w:eastAsia="Times New Roman" w:hAnsi="Times New Roman"/>
+          <w:i/>
+          <w:iCs/>
+          <w:sz w:val="24"/>
+          <w:szCs w:val="24"/>
+        </w:rPr>
+        <w:t xml:space="preserve">r_pen(xi) (лог-шкала)</w:t>
+      </w:r>
+    </w:p>
+    <w:p>
+      <w:pPr>
+        <w:spacing w:after="60" w:before="60" w:line="360"/>
+        <w:jc w:val="center"/>
+      </w:pPr>
+      <w:r>
+        <w:drawing>
+          <wp:inline distT="0" distB="0" distL="0" distR="0">
+            <wp:extent cx="5715000" cy="3314700"/>
+            <wp:effectExtent t="0" r="0" b="0" l="0"/>
+            <wp:docPr id="5" name=""/>
+            <wp:cNvGraphicFramePr>
+              <a:graphicFrameLocks xmlns:a="http://schemas.openxmlformats.org/drawingml/2006/main" noChangeAspect="1"/>
+            </wp:cNvGraphicFramePr>
+            <a:graphic xmlns:a="http://schemas.openxmlformats.org/drawingml/2006/main">
+              <a:graphicData uri="http://schemas.openxmlformats.org/drawingml/2006/picture">
+                <pic:pic xmlns:pic="http://schemas.openxmlformats.org/drawingml/2006/picture">
+                  <pic:nvPicPr>
+                    <pic:cNvPr id="0" name="" descr=""/>
+                    <pic:cNvPicPr>
+                      <a:picLocks noChangeAspect="1" noChangeArrowheads="1"/>
+                    </pic:cNvPicPr>
+                  </pic:nvPicPr>
+                  <pic:blipFill>
+                    <a:blip r:embed="rId12" cstate="none"/>
+                    <a:srcRect/>
+                    <a:stretch>
+                      <a:fillRect/>
+                    </a:stretch>
+                  </pic:blipFill>
+                  <pic:spPr bwMode="auto">
+                    <a:xfrm>
+                      <a:off x="0" y="0"/>
+                      <a:ext cx="5715000" cy="3314700"/>
+                    </a:xfrm>
+                    <a:prstGeom prst="rect">
+                      <a:avLst/>
+                    </a:prstGeom>
+                  </pic:spPr>
+                </pic:pic>
+              </a:graphicData>
+            </a:graphic>
+          </wp:inline>
+        </w:drawing>
+      </w:r>
+    </w:p>
+    <w:p>
+      <w:pPr>
+        <w:spacing w:after="60" w:before="60" w:line="360"/>
+        <w:jc w:val="center"/>
+      </w:pPr>
+      <w:r>
+        <w:rPr>
+          <w:rFonts w:ascii="Times New Roman" w:cs="Times New Roman" w:eastAsia="Times New Roman" w:hAnsi="Times New Roman"/>
+          <w:i/>
+          <w:iCs/>
+          <w:sz w:val="24"/>
+          <w:szCs w:val="24"/>
+        </w:rPr>
+        <w:t xml:space="preserve">Рисунок 6 - ход перелёта: расстояние xi(t) до Земли по оси</w:t>
+      </w:r>
+    </w:p>
+    <w:p>
+      <w:pPr>
+        <w:spacing w:after="60" w:before="60" w:line="360"/>
+        <w:jc w:val="center"/>
+      </w:pPr>
+      <w:r>
+        <w:rPr>
+          <w:rFonts w:ascii="Times New Roman" w:cs="Times New Roman" w:eastAsia="Times New Roman" w:hAnsi="Times New Roman"/>
+          <w:i/>
+          <w:iCs/>
+          <w:sz w:val="24"/>
+          <w:szCs w:val="24"/>
+        </w:rPr>
+        <w:t xml:space="preserve">Солнце - Земля -&gt; L2</w:t>
+      </w:r>
+    </w:p>
+    <w:p>
+      <w:pPr>
+        <w:spacing w:after="60" w:before="60" w:line="360"/>
+        <w:jc w:val="center"/>
+      </w:pPr>
+      <w:r>
+        <w:drawing>
+          <wp:inline distT="0" distB="0" distL="0" distR="0">
+            <wp:extent cx="5715000" cy="3133725"/>
+            <wp:effectExtent t="0" r="0" b="0" l="0"/>
+            <wp:docPr id="6" name=""/>
+            <wp:cNvGraphicFramePr>
+              <a:graphicFrameLocks xmlns:a="http://schemas.openxmlformats.org/drawingml/2006/main" noChangeAspect="1"/>
+            </wp:cNvGraphicFramePr>
+            <a:graphic xmlns:a="http://schemas.openxmlformats.org/drawingml/2006/main">
+              <a:graphicData uri="http://schemas.openxmlformats.org/drawingml/2006/picture">
+                <pic:pic xmlns:pic="http://schemas.openxmlformats.org/drawingml/2006/picture">
+                  <pic:nvPicPr>
+                    <pic:cNvPr id="0" name="" descr=""/>
+                    <pic:cNvPicPr>
+                      <a:picLocks noChangeAspect="1" noChangeArrowheads="1"/>
+                    </pic:cNvPicPr>
+                  </pic:nvPicPr>
+                  <pic:blipFill>
+                    <a:blip r:embed="rId13" cstate="none"/>
+                    <a:srcRect/>
+                    <a:stretch>
+                      <a:fillRect/>
+                    </a:stretch>
+                  </pic:blipFill>
+                  <pic:spPr bwMode="auto">
+                    <a:xfrm>
+                      <a:off x="0" y="0"/>
+                      <a:ext cx="5715000" cy="3133725"/>
+                    </a:xfrm>
+                    <a:prstGeom prst="rect">
+                      <a:avLst/>
+                    </a:prstGeom>
+                  </pic:spPr>
+                </pic:pic>
+              </a:graphicData>
+            </a:graphic>
+          </wp:inline>
+        </w:drawing>
+      </w:r>
+    </w:p>
+    <w:p>
+      <w:pPr>
+        <w:spacing w:after="60" w:before="60" w:line="360"/>
+        <w:jc w:val="center"/>
+      </w:pPr>
+      <w:r>
+        <w:rPr>
+          <w:rFonts w:ascii="Times New Roman" w:cs="Times New Roman" w:eastAsia="Times New Roman" w:hAnsi="Times New Roman"/>
+          <w:i/>
+          <w:iCs/>
+          <w:sz w:val="24"/>
+          <w:szCs w:val="24"/>
+        </w:rPr>
+        <w:t xml:space="preserve">Рисунок 7 - скорость: |v|(t) трассы и целевой орбиты в точке касания</w:t>
+      </w:r>
+    </w:p>
+    <w:p>
+      <w:pPr>
+        <w:spacing w:after="60" w:before="60" w:line="360"/>
+        <w:jc w:val="center"/>
+      </w:pPr>
+      <w:r>
+        <w:rPr>
+          <w:rFonts w:ascii="Times New Roman" w:cs="Times New Roman" w:eastAsia="Times New Roman" w:hAnsi="Times New Roman"/>
+          <w:i/>
+          <w:iCs/>
+          <w:sz w:val="24"/>
+          <w:szCs w:val="24"/>
+        </w:rPr>
+        <w:t xml:space="preserve">(штрих-пунктир); вход тормозной</w:t>
+      </w:r>
+    </w:p>
+    <w:p>
+      <w:pPr>
+        <w:spacing w:after="60" w:before="60" w:line="360"/>
+        <w:jc w:val="center"/>
+      </w:pPr>
+      <w:r>
+        <w:drawing>
+          <wp:inline distT="0" distB="0" distL="0" distR="0">
+            <wp:extent cx="5715000" cy="3314700"/>
+            <wp:effectExtent t="0" r="0" b="0" l="0"/>
+            <wp:docPr id="7" name=""/>
+            <wp:cNvGraphicFramePr>
+              <a:graphicFrameLocks xmlns:a="http://schemas.openxmlformats.org/drawingml/2006/main" noChangeAspect="1"/>
+            </wp:cNvGraphicFramePr>
+            <a:graphic xmlns:a="http://schemas.openxmlformats.org/drawingml/2006/main">
+              <a:graphicData uri="http://schemas.openxmlformats.org/drawingml/2006/picture">
+                <pic:pic xmlns:pic="http://schemas.openxmlformats.org/drawingml/2006/picture">
+                  <pic:nvPicPr>
+                    <pic:cNvPr id="0" name="" descr=""/>
+                    <pic:cNvPicPr>
+                      <a:picLocks noChangeAspect="1" noChangeArrowheads="1"/>
+                    </pic:cNvPicPr>
+                  </pic:nvPicPr>
+                  <pic:blipFill>
+                    <a:blip r:embed="rId14" cstate="none"/>
+                    <a:srcRect/>
+                    <a:stretch>
+                      <a:fillRect/>
+                    </a:stretch>
+                  </pic:blipFill>
+                  <pic:spPr bwMode="auto">
+                    <a:xfrm>
+                      <a:off x="0" y="0"/>
+                      <a:ext cx="5715000" cy="3314700"/>
                     </a:xfrm>
                     <a:prstGeom prst="rect">
                       <a:avLst/>

</xml_diff>

<commit_message>
Fig. 3 legend given its own strip; fig. 4 label moved off the legend
Рис. 3: the x-window is widened to 1081..2379 тыс. km - the data stop at 1679, so the
right ~700 тыс. km is an empty strip and the legend (гало / подлёт / точка входа) now sits
there instead of over the approach; aspect stays equal (adjustable="box"), so no geometry
is distorted.

Рис. 4: the note block went to the free right band at x = 1990 (nothing exists beyond
1679 at any height), vertically centred, and the legend keeps short labels (полутень
Земли, порог Az_min = 12.3 тыс. км) at the lower left - they can no longer meet.

Both are checked by geometry, not by taste: a new check_clear() draws the figure, takes
the real screen bboxes of the legend and the text blocks and fails if any pair overlaps
(рис. 3, 4, 5), and the window asserts now also require >= 500 тыс. km of free room for
the fig. 3 legend and that the fig. 4 label sits beyond all data.
</commit_message>
<xml_diff>
--- a/Raschet_L2_perelet.docx
+++ b/Raschet_L2_perelet.docx
@@ -7942,7 +7942,7 @@
       <w:r>
         <w:drawing>
           <wp:inline distT="0" distB="0" distL="0" distR="0">
-            <wp:extent cx="5334000" cy="3914775"/>
+            <wp:extent cx="5334000" cy="3352800"/>
             <wp:effectExtent t="0" r="0" b="0" l="0"/>
             <wp:docPr id="3" name=""/>
             <wp:cNvGraphicFramePr>
@@ -7967,7 +7967,7 @@
                   <pic:spPr bwMode="auto">
                     <a:xfrm>
                       <a:off x="0" y="0"/>
-                      <a:ext cx="5334000" cy="3914775"/>
+                      <a:ext cx="5334000" cy="3352800"/>
                     </a:xfrm>
                     <a:prstGeom prst="rect">
                       <a:avLst/>

</xml_diff>

<commit_message>
Fig. 3 x-range fixed at 1100..1700 with a doubled frame; fig. 4 label to the top right
Рис. 3: the data range is now exactly the 1100..1700 тыс. km asked for (the previous
1081..2379 stretched the range instead of the frame) and the canvas is 9.8 in wide,
about twice the old one. Widening the frame alone was not enough: 158 halo samples and
32 coast samples live in the bottom-right corner (xi 1350..1700, eta < -450), so the
legend would sit on the curves - a 300 тыс. km clean band was opened under them along
eta, and the legend occupies that band. A new assert maps the legend box back into data
coordinates and fails if any curve sample falls under it.

Рис. 4: the "…±13,4 тыс. км…" block moved to the top-right corner (still beyond all
data: nothing exists right of xi = 1679), checked by the same overlap test.
</commit_message>
<xml_diff>
--- a/Raschet_L2_perelet.docx
+++ b/Raschet_L2_perelet.docx
@@ -7942,7 +7942,7 @@
       <w:r>
         <w:drawing>
           <wp:inline distT="0" distB="0" distL="0" distR="0">
-            <wp:extent cx="5334000" cy="3352800"/>
+            <wp:extent cx="5334000" cy="2390775"/>
             <wp:effectExtent t="0" r="0" b="0" l="0"/>
             <wp:docPr id="3" name=""/>
             <wp:cNvGraphicFramePr>
@@ -7967,7 +7967,7 @@
                   <pic:spPr bwMode="auto">
                     <a:xfrm>
                       <a:off x="0" y="0"/>
-                      <a:ext cx="5334000" cy="3352800"/>
+                      <a:ext cx="5334000" cy="2390775"/>
                     </a:xfrm>
                     <a:prstGeom prst="rect">
                       <a:avLst/>

</xml_diff>